<commit_message>
Update report files: docx modified, PDF added
Modify Islam_Saiful_final_report.docx, add Sajol_Md_Saiful_Islam_final_report.pdf, and remove the temporary ~$lam_Saiful_final_report.docx file. Adds the final PDF report and updates the DOCX artifact.
</commit_message>
<xml_diff>
--- a/Islam_Saiful_final_report.docx
+++ b/Islam_Saiful_final_report.docx
@@ -30,6 +30,39 @@
     <w:p>
       <w:pPr>
         <w:spacing w:after="120" w:line="360" w:lineRule="auto"/>
+        <w:rPr>
+          <w:bCs/>
+          <w:sz w:val="28"/>
+        </w:rPr>
+      </w:pPr>
+      <w:r>
+        <w:rPr>
+          <w:b/>
+          <w:sz w:val="28"/>
+        </w:rPr>
+        <w:t xml:space="preserve">Git Link: </w:t>
+      </w:r>
+      <w:hyperlink r:id="rId6" w:history="1">
+        <w:r>
+          <w:rPr>
+            <w:rStyle w:val="Hyperlink"/>
+            <w:bCs/>
+            <w:sz w:val="28"/>
+          </w:rPr>
+          <w:t>https://github.com/MdSaifulIslamSajol/csc7644-final-project-Sajol</w:t>
+        </w:r>
+      </w:hyperlink>
+      <w:r>
+        <w:rPr>
+          <w:b/>
+          <w:sz w:val="28"/>
+        </w:rPr>
+        <w:t xml:space="preserve"> </w:t>
+      </w:r>
+    </w:p>
+    <w:p>
+      <w:pPr>
+        <w:spacing w:after="120" w:line="360" w:lineRule="auto"/>
       </w:pPr>
       <w:r>
         <w:rPr>
@@ -72,11 +105,11 @@
         <w:spacing w:after="120" w:line="360" w:lineRule="auto"/>
       </w:pPr>
       <w:r>
-        <w:t xml:space="preserve">An LLM-based solution is appropriate because the underlying tasks are exactly those at which large language models excel: identifying thematic relevance, summarizing prose, and rendering output in a structured format. When combined with a real-time web-search tool (to ground the model in current articles rather than its training data) and a small graph that chains fetch, summarize, and persist steps, the result is an autonomous workflow that produces a ready-to-read briefing. Beyond personal productivity, the underlying agentic pattern — a controller LLM that orchestrates tool calls, retrieval, and post-processing — is the same pattern used for </w:t>
+        <w:t xml:space="preserve">An LLM-based solution is appropriate because the underlying tasks are exactly those at which large language models excel: identifying thematic relevance, summarizing prose, and rendering output in a structured format. When combined with a real-time web-search tool (to ground the model in current articles rather than its training data) and a small graph that chains fetch, summarize, and persist steps, the result is an autonomous workflow that produces a ready-to-read briefing. Beyond personal productivity, the underlying agentic pattern — a </w:t>
       </w:r>
       <w:r>
         <w:lastRenderedPageBreak/>
-        <w:t>production assistants in finance, healthcare, and legal research. Building it end-to-end on free-tier infrastructure, with evaluation, demonstrates competence in modern LLM application engineering at low cost.</w:t>
+        <w:t>controller LLM that orchestrates tool calls, retrieval, and post-processing — is the same pattern used for production assistants in finance, healthcare, and legal research. Building it end-to-end on free-tier infrastructure, with evaluation, demonstrates competence in modern LLM application engineering at low cost.</w:t>
       </w:r>
     </w:p>
     <w:p>
@@ -382,6 +415,7 @@
         <w:spacing w:after="40" w:line="360" w:lineRule="auto"/>
       </w:pPr>
       <w:r>
+        <w:lastRenderedPageBreak/>
         <w:t>AI News: a three-node pipeline (fetch_news, summarize_news, save_result) that issues a Tavily news query for the chosen time range, hands the article list to the LLM with a markdown system-prompt template, and writes the digest to disk. This is the primary deliverable that addresses the news-overload problem.</w:t>
       </w:r>
     </w:p>
@@ -393,7 +427,6 @@
         <w:rPr>
           <w:b/>
         </w:rPr>
-        <w:lastRenderedPageBreak/>
         <w:t>2.3 Data Sources, Models, and Prompt Design</w:t>
       </w:r>
     </w:p>
@@ -479,7 +512,11 @@
         <w:spacing w:after="120" w:line="360" w:lineRule="auto"/>
       </w:pPr>
       <w:r>
-        <w:t>An automated harness (batch_run.py) executed 80 logged runs covering 5 models x 3 use cases, with 5 prompts per chatbot case, a 5-trigger / 5-no-trigger split for the tool-routing case, and the Weekly frequency for AI News. Every response was written to evaluations/&lt;usecase&gt;/&lt;model&gt;/&lt;timestamp&gt;.md with YAML frontmatter capturing latency, token usage, and (for the tool case) routing correctness. The aggregation script evaluate.py walks that tree and produces both summary tables and a CSV roll-up.</w:t>
+        <w:t xml:space="preserve">An automated harness (batch_run.py) executed 80 logged runs covering 5 models x 3 use cases, with 5 prompts per chatbot case, a 5-trigger / 5-no-trigger split for the tool-routing case, and the Weekly frequency for AI News. Every response was written to evaluations/&lt;usecase&gt;/&lt;model&gt;/&lt;timestamp&gt;.md with YAML </w:t>
+      </w:r>
+      <w:r>
+        <w:lastRenderedPageBreak/>
+        <w:t>frontmatter capturing latency, token usage, and (for the tool case) routing correctness. The aggregation script evaluate.py walks that tree and produces both summary tables and a CSV roll-up.</w:t>
       </w:r>
     </w:p>
     <w:p>
@@ -520,7 +557,6 @@
               <w:spacing w:line="276" w:lineRule="auto"/>
             </w:pPr>
             <w:r>
-              <w:lastRenderedPageBreak/>
               <w:t>Model</w:t>
             </w:r>
           </w:p>
@@ -1017,7 +1053,7 @@
                     <pic:cNvPicPr/>
                   </pic:nvPicPr>
                   <pic:blipFill>
-                    <a:blip r:embed="rId6"/>
+                    <a:blip r:embed="rId7"/>
                     <a:stretch>
                       <a:fillRect/>
                     </a:stretch>
@@ -1166,6 +1202,7 @@
               <w:rPr>
                 <w:b w:val="0"/>
               </w:rPr>
+              <w:lastRenderedPageBreak/>
               <w:t>llama-3.3-70b-versatile</w:t>
             </w:r>
           </w:p>
@@ -1430,7 +1467,6 @@
               <w:rPr>
                 <w:b w:val="0"/>
               </w:rPr>
-              <w:lastRenderedPageBreak/>
               <w:t>qwen/qwen3-32b</w:t>
             </w:r>
           </w:p>
@@ -1519,7 +1555,7 @@
                     <pic:cNvPicPr/>
                   </pic:nvPicPr>
                   <pic:blipFill>
-                    <a:blip r:embed="rId7"/>
+                    <a:blip r:embed="rId8"/>
                     <a:stretch>
                       <a:fillRect/>
                     </a:stretch>
@@ -1591,7 +1627,7 @@
                     <pic:cNvPicPr/>
                   </pic:nvPicPr>
                   <pic:blipFill>
-                    <a:blip r:embed="rId8"/>
+                    <a:blip r:embed="rId9"/>
                     <a:stretch>
                       <a:fillRect/>
                     </a:stretch>
@@ -13724,6 +13760,29 @@
       </w:tcPr>
     </w:tblStylePr>
   </w:style>
+  <w:style w:type="character" w:styleId="Hyperlink">
+    <w:name w:val="Hyperlink"/>
+    <w:basedOn w:val="DefaultParagraphFont"/>
+    <w:uiPriority w:val="99"/>
+    <w:unhideWhenUsed/>
+    <w:rsid w:val="00041E8B"/>
+    <w:rPr>
+      <w:color w:val="0000FF" w:themeColor="hyperlink"/>
+      <w:u w:val="single"/>
+    </w:rPr>
+  </w:style>
+  <w:style w:type="character" w:styleId="UnresolvedMention">
+    <w:name w:val="Unresolved Mention"/>
+    <w:basedOn w:val="DefaultParagraphFont"/>
+    <w:uiPriority w:val="99"/>
+    <w:semiHidden/>
+    <w:unhideWhenUsed/>
+    <w:rsid w:val="00041E8B"/>
+    <w:rPr>
+      <w:color w:val="605E5C"/>
+      <w:shd w:val="clear" w:color="auto" w:fill="E1DFDD"/>
+    </w:rPr>
+  </w:style>
 </w:styles>
 </file>
 

</xml_diff>